<commit_message>
Repair slide 37 in Class 16 slides.
</commit_message>
<xml_diff>
--- a/class16w.docx
+++ b/class16w.docx
@@ -8145,7 +8145,7 @@
         <w:t xml:space="preserve"> </w:t>
       </w:r>
       <w:r>
-        <w:t xml:space="preserve">= 57.42, with 90% confidence interval (38.47, 76.38).</w:t>
+        <w:t xml:space="preserve">= 57.42, with 90% confidence interval (55.82, 59.02).</w:t>
       </w:r>
     </w:p>
     <w:p>
@@ -8199,7 +8199,7 @@
         <w:t xml:space="preserve"> </w:t>
       </w:r>
       <w:r>
-        <w:t xml:space="preserve">= 59.73, with 90% CI (40.75, 78.70).</w:t>
+        <w:t xml:space="preserve">= 59.73, with 90% CI (57.91, 61.55).</w:t>
       </w:r>
     </w:p>
     <w:bookmarkEnd w:id="92"/>
@@ -19493,7 +19493,7 @@
         <w:rPr>
           <w:rStyle w:val="VerbatimChar"/>
         </w:rPr>
-        <w:t xml:space="preserve">  hms_1.1.3              htmltools_0.5.8.1      httr_1.4.7            </w:t>
+        <w:t xml:space="preserve">  hms_1.1.4              htmltools_0.5.8.1      httr_1.4.7            </w:t>
       </w:r>
       <w:r>
         <w:br/>
@@ -19574,7 +19574,7 @@
         <w:rPr>
           <w:rStyle w:val="VerbatimChar"/>
         </w:rPr>
-        <w:t xml:space="preserve">  modelr_0.1.11          multcomp_1.4-28        mvtnorm_1.3-3         </w:t>
+        <w:t xml:space="preserve">  modelr_0.1.11          multcomp_1.4-29        mvtnorm_1.3-3         </w:t>
       </w:r>
       <w:r>
         <w:br/>
@@ -19745,7 +19745,7 @@
         <w:rPr>
           <w:rStyle w:val="VerbatimChar"/>
         </w:rPr>
-        <w:t xml:space="preserve">  systemfonts_1.3.1      textshaping_1.0.3      TH.data_1.1-4         </w:t>
+        <w:t xml:space="preserve">  systemfonts_1.3.1      textshaping_1.0.4      TH.data_1.1-4         </w:t>
       </w:r>
       <w:r>
         <w:br/>

</xml_diff>